<commit_message>
Moved lab 1 files to separate folder
</commit_message>
<xml_diff>
--- a/lab1/report1.2.docx
+++ b/lab1/report1.2.docx
@@ -229,7 +229,6 @@
       <w:pPr>
         <w:pStyle w:val="Normal"/>
         <w:widowControl w:val="false"/>
-        <w:pBdr/>
         <w:spacing w:lineRule="auto" w:line="240" w:before="5" w:after="0"/>
         <w:jc w:val="center"/>
         <w:rPr>
@@ -437,7 +436,7 @@
       <w:pPr>
         <w:pStyle w:val="Normal"/>
         <w:spacing w:lineRule="auto" w:line="360"/>
-        <w:ind w:start="5896"/>
+        <w:ind w:left="5896"/>
         <w:rPr>
           <w:rFonts w:ascii="Times New Roman" w:hAnsi="Times New Roman" w:cs="Times New Roman"/>
           <w:sz w:val="28"/>
@@ -450,48 +449,13 @@
           <w:sz w:val="28"/>
           <w:szCs w:val="28"/>
         </w:rPr>
-        <w:t>Викона</w:t>
-      </w:r>
-      <w:r>
-        <w:rPr>
-          <w:rFonts w:cs="Times New Roman" w:ascii="Times New Roman" w:hAnsi="Times New Roman"/>
-          <w:sz w:val="28"/>
-          <w:szCs w:val="28"/>
-          <w:lang w:val="ru-RU"/>
-        </w:rPr>
-        <w:t>в</w:t>
-      </w:r>
-      <w:r>
-        <w:rPr>
-          <w:rFonts w:cs="Times New Roman" w:ascii="Times New Roman" w:hAnsi="Times New Roman"/>
-          <w:sz w:val="28"/>
-          <w:szCs w:val="28"/>
-        </w:rPr>
-        <w:t xml:space="preserve"> студент</w:t>
-      </w:r>
-      <w:r>
-        <w:rPr>
-          <w:rFonts w:cs="Times New Roman" w:ascii="Times New Roman" w:hAnsi="Times New Roman"/>
-          <w:sz w:val="28"/>
-          <w:szCs w:val="28"/>
-          <w:lang w:val="ru-RU"/>
-        </w:rPr>
-        <w:t xml:space="preserve"> </w:t>
-      </w:r>
-      <w:r>
-        <w:rPr>
-          <w:rFonts w:cs="Times New Roman" w:ascii="Times New Roman" w:hAnsi="Times New Roman"/>
-          <w:sz w:val="28"/>
-          <w:szCs w:val="28"/>
-        </w:rPr>
-        <w:t>ІІ курсу</w:t>
       </w:r>
     </w:p>
     <w:p>
       <w:pPr>
         <w:pStyle w:val="Normal"/>
         <w:spacing w:lineRule="auto" w:line="360"/>
-        <w:ind w:start="5896"/>
+        <w:ind w:left="5896"/>
         <w:rPr>
           <w:rFonts w:ascii="Times New Roman" w:hAnsi="Times New Roman" w:cs="Times New Roman"/>
           <w:sz w:val="28"/>
@@ -504,14 +468,13 @@
           <w:sz w:val="28"/>
           <w:szCs w:val="28"/>
         </w:rPr>
-        <w:t>спеціальності “Інженерія</w:t>
       </w:r>
     </w:p>
     <w:p>
       <w:pPr>
         <w:pStyle w:val="Normal"/>
         <w:spacing w:lineRule="auto" w:line="360"/>
-        <w:ind w:start="5896"/>
+        <w:ind w:left="5896"/>
         <w:rPr>
           <w:rFonts w:ascii="Times New Roman" w:hAnsi="Times New Roman" w:cs="Times New Roman"/>
           <w:sz w:val="28"/>
@@ -524,20 +487,122 @@
           <w:sz w:val="28"/>
           <w:szCs w:val="28"/>
         </w:rPr>
-        <w:t>програмного забезпечення.”</w:t>
       </w:r>
     </w:p>
     <w:p>
       <w:pPr>
         <w:pStyle w:val="Normal"/>
         <w:spacing w:lineRule="auto" w:line="360"/>
-        <w:ind w:start="5896"/>
+        <w:ind w:left="5896"/>
         <w:rPr>
           <w:rFonts w:ascii="Times New Roman" w:hAnsi="Times New Roman" w:cs="Times New Roman"/>
           <w:sz w:val="28"/>
           <w:szCs w:val="28"/>
         </w:rPr>
       </w:pPr>
+      <w:r>
+        <w:rPr>
+          <w:rFonts w:cs="Times New Roman" w:ascii="Times New Roman" w:hAnsi="Times New Roman"/>
+          <w:sz w:val="28"/>
+          <w:szCs w:val="28"/>
+        </w:rPr>
+      </w:r>
+    </w:p>
+    <w:p>
+      <w:pPr>
+        <w:pStyle w:val="Normal"/>
+        <w:spacing w:lineRule="auto" w:line="360"/>
+        <w:ind w:left="5896"/>
+        <w:rPr>
+          <w:rFonts w:ascii="Times New Roman" w:hAnsi="Times New Roman" w:cs="Times New Roman"/>
+          <w:sz w:val="28"/>
+          <w:szCs w:val="28"/>
+        </w:rPr>
+      </w:pPr>
+      <w:r>
+        <w:rPr>
+          <w:rFonts w:cs="Times New Roman" w:ascii="Times New Roman" w:hAnsi="Times New Roman"/>
+          <w:sz w:val="28"/>
+          <w:szCs w:val="28"/>
+        </w:rPr>
+      </w:r>
+    </w:p>
+    <w:p>
+      <w:pPr>
+        <w:pStyle w:val="Normal"/>
+        <w:spacing w:lineRule="auto" w:line="360"/>
+        <w:ind w:left="5896"/>
+        <w:rPr>
+          <w:rFonts w:ascii="Times New Roman" w:hAnsi="Times New Roman" w:cs="Times New Roman"/>
+          <w:sz w:val="28"/>
+          <w:szCs w:val="28"/>
+        </w:rPr>
+      </w:pPr>
+      <w:r>
+        <w:rPr>
+          <w:rFonts w:cs="Times New Roman" w:ascii="Times New Roman" w:hAnsi="Times New Roman"/>
+          <w:sz w:val="28"/>
+          <w:szCs w:val="28"/>
+        </w:rPr>
+      </w:r>
+    </w:p>
+    <w:p>
+      <w:pPr>
+        <w:pStyle w:val="Normal"/>
+        <w:spacing w:lineRule="auto" w:line="360"/>
+        <w:ind w:left="5896"/>
+        <w:rPr>
+          <w:rFonts w:ascii="Times New Roman" w:hAnsi="Times New Roman" w:cs="Times New Roman"/>
+          <w:sz w:val="28"/>
+          <w:szCs w:val="28"/>
+        </w:rPr>
+      </w:pPr>
+      <w:r>
+        <w:rPr>
+          <w:rFonts w:cs="Times New Roman" w:ascii="Times New Roman" w:hAnsi="Times New Roman"/>
+          <w:sz w:val="28"/>
+          <w:szCs w:val="28"/>
+        </w:rPr>
+      </w:r>
+    </w:p>
+    <w:p>
+      <w:pPr>
+        <w:pStyle w:val="Normal"/>
+        <w:spacing w:lineRule="auto" w:line="360"/>
+        <w:ind w:left="5896"/>
+        <w:rPr>
+          <w:rFonts w:ascii="Times New Roman" w:hAnsi="Times New Roman" w:cs="Times New Roman"/>
+          <w:sz w:val="28"/>
+          <w:szCs w:val="28"/>
+        </w:rPr>
+      </w:pPr>
+      <w:r>
+        <w:rPr>
+          <w:rFonts w:cs="Times New Roman" w:ascii="Times New Roman" w:hAnsi="Times New Roman"/>
+          <w:sz w:val="28"/>
+          <w:szCs w:val="28"/>
+        </w:rPr>
+      </w:r>
+    </w:p>
+    <w:p>
+      <w:pPr>
+        <w:pStyle w:val="Normal"/>
+        <w:spacing w:lineRule="auto" w:line="360"/>
+        <w:ind w:left="5896"/>
+        <w:rPr>
+          <w:rFonts w:ascii="Times New Roman" w:hAnsi="Times New Roman" w:cs="Times New Roman"/>
+          <w:sz w:val="28"/>
+          <w:szCs w:val="28"/>
+        </w:rPr>
+      </w:pPr>
+      <w:r>
+        <w:rPr>
+          <w:rFonts w:cs="Times New Roman" w:ascii="Times New Roman" w:hAnsi="Times New Roman"/>
+          <w:sz w:val="28"/>
+          <w:szCs w:val="28"/>
+        </w:rPr>
+        <w:t>Викона</w:t>
+      </w:r>
       <w:r>
         <w:rPr>
           <w:rFonts w:cs="Times New Roman" w:ascii="Times New Roman" w:hAnsi="Times New Roman"/>
@@ -545,7 +610,93 @@
           <w:szCs w:val="28"/>
           <w:lang w:val="ru-RU"/>
         </w:rPr>
-        <w:t>Зікур Андрій Андрійович</w:t>
+        <w:t>в</w:t>
+      </w:r>
+      <w:r>
+        <w:rPr>
+          <w:rFonts w:cs="Times New Roman" w:ascii="Times New Roman" w:hAnsi="Times New Roman"/>
+          <w:sz w:val="28"/>
+          <w:szCs w:val="28"/>
+        </w:rPr>
+        <w:t xml:space="preserve"> студент</w:t>
+      </w:r>
+      <w:r>
+        <w:rPr>
+          <w:rFonts w:cs="Times New Roman" w:ascii="Times New Roman" w:hAnsi="Times New Roman"/>
+          <w:sz w:val="28"/>
+          <w:szCs w:val="28"/>
+          <w:lang w:val="ru-RU"/>
+        </w:rPr>
+        <w:t xml:space="preserve"> </w:t>
+      </w:r>
+      <w:r>
+        <w:rPr>
+          <w:rFonts w:cs="Times New Roman" w:ascii="Times New Roman" w:hAnsi="Times New Roman"/>
+          <w:sz w:val="28"/>
+          <w:szCs w:val="28"/>
+        </w:rPr>
+        <w:t>ІІ курсу</w:t>
+      </w:r>
+    </w:p>
+    <w:p>
+      <w:pPr>
+        <w:pStyle w:val="Normal"/>
+        <w:spacing w:lineRule="auto" w:line="360"/>
+        <w:ind w:left="5896"/>
+        <w:rPr>
+          <w:rFonts w:ascii="Times New Roman" w:hAnsi="Times New Roman" w:cs="Times New Roman"/>
+          <w:sz w:val="28"/>
+          <w:szCs w:val="28"/>
+        </w:rPr>
+      </w:pPr>
+      <w:r>
+        <w:rPr>
+          <w:rFonts w:cs="Times New Roman" w:ascii="Times New Roman" w:hAnsi="Times New Roman"/>
+          <w:sz w:val="28"/>
+          <w:szCs w:val="28"/>
+        </w:rPr>
+        <w:t>спеціальності “Інженерія</w:t>
+      </w:r>
+    </w:p>
+    <w:p>
+      <w:pPr>
+        <w:pStyle w:val="Normal"/>
+        <w:spacing w:lineRule="auto" w:line="360"/>
+        <w:ind w:left="5896"/>
+        <w:rPr>
+          <w:rFonts w:ascii="Times New Roman" w:hAnsi="Times New Roman" w:cs="Times New Roman"/>
+          <w:sz w:val="28"/>
+          <w:szCs w:val="28"/>
+        </w:rPr>
+      </w:pPr>
+      <w:r>
+        <w:rPr>
+          <w:rFonts w:cs="Times New Roman" w:ascii="Times New Roman" w:hAnsi="Times New Roman"/>
+          <w:sz w:val="28"/>
+          <w:szCs w:val="28"/>
+        </w:rPr>
+        <w:t>програмного забезпечення.”</w:t>
+      </w:r>
+    </w:p>
+    <w:p>
+      <w:pPr>
+        <w:pStyle w:val="Normal"/>
+        <w:spacing w:lineRule="auto" w:line="360"/>
+        <w:ind w:left="5896"/>
+        <w:rPr>
+          <w:rFonts w:ascii="Times New Roman" w:hAnsi="Times New Roman" w:cs="Times New Roman"/>
+          <w:sz w:val="28"/>
+          <w:szCs w:val="28"/>
+        </w:rPr>
+      </w:pPr>
+      <w:r>
+        <w:rPr>
+          <w:rFonts w:cs="Times New Roman" w:ascii="Times New Roman" w:hAnsi="Times New Roman"/>
+          <w:sz w:val="28"/>
+          <w:szCs w:val="28"/>
+          <w:lang w:val="ru-RU"/>
+        </w:rPr>
+        <w:t>Стріжак Максим Тарасович</w:t>
       </w:r>
     </w:p>
     <w:p>
@@ -609,100 +760,6 @@
         <w:pStyle w:val="Normal"/>
         <w:spacing w:lineRule="auto" w:line="360"/>
         <w:jc w:val="center"/>
-        <w:rPr/>
-      </w:pPr>
-      <w:r>
-        <w:rPr/>
-      </w:r>
-    </w:p>
-    <w:p>
-      <w:pPr>
-        <w:pStyle w:val="Normal"/>
-        <w:spacing w:lineRule="auto" w:line="360"/>
-        <w:jc w:val="center"/>
-        <w:rPr>
-          <w:lang w:val="en-US"/>
-        </w:rPr>
-      </w:pPr>
-      <w:r>
-        <w:rPr>
-          <w:lang w:val="en-US"/>
-        </w:rPr>
-      </w:r>
-    </w:p>
-    <w:p>
-      <w:pPr>
-        <w:pStyle w:val="Normal"/>
-        <w:spacing w:lineRule="auto" w:line="360"/>
-        <w:jc w:val="center"/>
-        <w:rPr/>
-      </w:pPr>
-      <w:r>
-        <w:rPr/>
-      </w:r>
-    </w:p>
-    <w:p>
-      <w:pPr>
-        <w:pStyle w:val="Normal"/>
-        <w:spacing w:lineRule="auto" w:line="360"/>
-        <w:jc w:val="center"/>
-        <w:rPr/>
-      </w:pPr>
-      <w:r>
-        <w:rPr/>
-      </w:r>
-    </w:p>
-    <w:p>
-      <w:pPr>
-        <w:pStyle w:val="Normal"/>
-        <w:spacing w:lineRule="auto" w:line="360"/>
-        <w:jc w:val="center"/>
-        <w:rPr>
-          <w:rFonts w:ascii="Times New Roman" w:hAnsi="Times New Roman" w:cs="Times New Roman"/>
-          <w:b/>
-          <w:bCs/>
-          <w:sz w:val="28"/>
-          <w:szCs w:val="28"/>
-        </w:rPr>
-      </w:pPr>
-      <w:r>
-        <w:rPr>
-          <w:rFonts w:cs="Times New Roman" w:ascii="Times New Roman" w:hAnsi="Times New Roman"/>
-          <w:b/>
-          <w:bCs/>
-          <w:sz w:val="28"/>
-          <w:szCs w:val="28"/>
-        </w:rPr>
-      </w:r>
-    </w:p>
-    <w:p>
-      <w:pPr>
-        <w:pStyle w:val="Normal"/>
-        <w:spacing w:lineRule="auto" w:line="360"/>
-        <w:jc w:val="center"/>
-        <w:rPr>
-          <w:rFonts w:ascii="Times New Roman" w:hAnsi="Times New Roman" w:cs="Times New Roman"/>
-          <w:b/>
-          <w:bCs/>
-          <w:sz w:val="28"/>
-          <w:szCs w:val="28"/>
-        </w:rPr>
-      </w:pPr>
-      <w:r>
-        <w:rPr>
-          <w:rFonts w:cs="Times New Roman" w:ascii="Times New Roman" w:hAnsi="Times New Roman"/>
-          <w:b/>
-          <w:bCs/>
-          <w:sz w:val="28"/>
-          <w:szCs w:val="28"/>
-        </w:rPr>
-      </w:r>
-    </w:p>
-    <w:p>
-      <w:pPr>
-        <w:pStyle w:val="Normal"/>
-        <w:spacing w:lineRule="auto" w:line="360"/>
-        <w:jc w:val="center"/>
         <w:rPr>
           <w:rFonts w:ascii="Times New Roman" w:hAnsi="Times New Roman" w:cs="Times New Roman"/>
           <w:b/>
@@ -736,61 +793,9 @@
     </w:p>
     <w:p>
       <w:pPr>
-        <w:pStyle w:val="Normal"/>
-        <w:rPr>
-          <w:lang w:val="ru-RU"/>
-        </w:rPr>
-      </w:pPr>
-      <w:r>
-        <w:rPr>
-          <w:lang w:val="ru-RU"/>
-        </w:rPr>
-      </w:r>
-    </w:p>
-    <w:p>
-      <w:pPr>
-        <w:pStyle w:val="Normal"/>
-        <w:rPr>
-          <w:lang w:val="ru-RU"/>
-        </w:rPr>
-      </w:pPr>
-      <w:r>
-        <w:rPr>
-          <w:lang w:val="ru-RU"/>
-        </w:rPr>
-      </w:r>
-    </w:p>
-    <w:p>
-      <w:pPr>
-        <w:pStyle w:val="Normal"/>
-        <w:rPr>
-          <w:lang w:val="ru-RU"/>
-        </w:rPr>
-      </w:pPr>
-      <w:r>
-        <w:rPr>
-          <w:lang w:val="ru-RU"/>
-        </w:rPr>
-      </w:r>
-    </w:p>
-    <w:p>
-      <w:pPr>
-        <w:pStyle w:val="Normal"/>
-        <w:rPr>
-          <w:lang w:val="ru-RU"/>
-        </w:rPr>
-      </w:pPr>
-      <w:r>
-        <w:rPr>
-          <w:lang w:val="ru-RU"/>
-        </w:rPr>
-      </w:r>
-    </w:p>
-    <w:p>
-      <w:pPr>
         <w:pStyle w:val="NormalWeb"/>
         <w:spacing w:lineRule="auto" w:line="360" w:before="280" w:after="280"/>
-        <w:jc w:val="start"/>
+        <w:jc w:val="left"/>
         <w:rPr>
           <w:sz w:val="28"/>
           <w:szCs w:val="28"/>
@@ -1056,7 +1061,7 @@
       <w:pPr>
         <w:pStyle w:val="BodyText"/>
         <w:spacing w:lineRule="auto" w:line="360"/>
-        <w:jc w:val="start"/>
+        <w:jc w:val="left"/>
         <w:rPr>
           <w:rFonts w:ascii="Times New Roman" w:hAnsi="Times New Roman" w:cs="Times New Roman"/>
           <w:sz w:val="28"/>
@@ -1088,7 +1093,7 @@
           <w:tab w:val="left" w:pos="0" w:leader="none"/>
         </w:tabs>
         <w:spacing w:lineRule="auto" w:line="360" w:before="0" w:after="0"/>
-        <w:ind w:hanging="283" w:start="709"/>
+        <w:ind w:hanging="283" w:left="709"/>
         <w:jc w:val="both"/>
         <w:rPr>
           <w:rFonts w:ascii="Times New Roman" w:hAnsi="Times New Roman" w:cs="Times New Roman"/>
@@ -1104,25 +1109,7 @@
           <w:szCs w:val="28"/>
           <w:lang w:val="ru-RU"/>
         </w:rPr>
-        <w:t>x(t)=</w:t>
-      </w:r>
-      <w:r>
-        <w:rPr>
-          <w:rFonts w:cs="Times New Roman" w:ascii="Times New Roman" w:hAnsi="Times New Roman"/>
-          <w:sz w:val="28"/>
-          <w:szCs w:val="28"/>
-          <w:lang w:val="ru-RU"/>
-        </w:rPr>
-        <w:t>x</w:t>
-      </w:r>
-      <w:r>
-        <w:rPr>
-          <w:rFonts w:cs="Times New Roman" w:ascii="Times New Roman" w:hAnsi="Times New Roman"/>
-          <w:sz w:val="28"/>
-          <w:szCs w:val="28"/>
-          <w:lang w:val="ru-RU"/>
-        </w:rPr>
-        <w:t xml:space="preserve">0​+v0​sin(α)⋅t+2at2​ </w:t>
+        <w:t xml:space="preserve">x(t)=x0​+v0​sin(α)⋅t+2at2​ </w:t>
       </w:r>
     </w:p>
     <w:p>
@@ -1137,7 +1124,7 @@
           <w:tab w:val="left" w:pos="0" w:leader="none"/>
         </w:tabs>
         <w:spacing w:lineRule="auto" w:line="360"/>
-        <w:ind w:hanging="283" w:start="709"/>
+        <w:ind w:hanging="283" w:left="709"/>
         <w:jc w:val="both"/>
         <w:rPr>
           <w:rFonts w:ascii="Times New Roman" w:hAnsi="Times New Roman" w:cs="Times New Roman"/>
@@ -1186,7 +1173,7 @@
           <w:tab w:val="left" w:pos="0" w:leader="none"/>
         </w:tabs>
         <w:spacing w:lineRule="auto" w:line="360" w:before="0" w:after="0"/>
-        <w:ind w:hanging="283" w:start="709"/>
+        <w:ind w:hanging="283" w:left="709"/>
         <w:jc w:val="both"/>
         <w:rPr>
           <w:rFonts w:ascii="Times New Roman" w:hAnsi="Times New Roman" w:cs="Times New Roman"/>
@@ -1236,7 +1223,7 @@
           <w:tab w:val="left" w:pos="0" w:leader="none"/>
         </w:tabs>
         <w:spacing w:lineRule="auto" w:line="360" w:before="0" w:after="0"/>
-        <w:ind w:hanging="283" w:start="709"/>
+        <w:ind w:hanging="283" w:left="709"/>
         <w:jc w:val="both"/>
         <w:rPr>
           <w:rFonts w:ascii="Times New Roman" w:hAnsi="Times New Roman" w:cs="Times New Roman"/>
@@ -1267,7 +1254,7 @@
           <w:tab w:val="left" w:pos="0" w:leader="none"/>
         </w:tabs>
         <w:spacing w:lineRule="auto" w:line="360" w:before="0" w:after="0"/>
-        <w:ind w:hanging="283" w:start="709"/>
+        <w:ind w:hanging="283" w:left="709"/>
         <w:jc w:val="both"/>
         <w:rPr>
           <w:rFonts w:ascii="Times New Roman" w:hAnsi="Times New Roman" w:cs="Times New Roman"/>
@@ -1298,7 +1285,7 @@
           <w:tab w:val="left" w:pos="0" w:leader="none"/>
         </w:tabs>
         <w:spacing w:lineRule="auto" w:line="360" w:before="0" w:after="0"/>
-        <w:ind w:hanging="283" w:start="1418"/>
+        <w:ind w:hanging="283" w:left="1418"/>
         <w:jc w:val="both"/>
         <w:rPr>
           <w:rFonts w:ascii="Times New Roman" w:hAnsi="Times New Roman" w:cs="Times New Roman"/>
@@ -1329,7 +1316,7 @@
           <w:tab w:val="left" w:pos="0" w:leader="none"/>
         </w:tabs>
         <w:spacing w:lineRule="auto" w:line="360" w:before="0" w:after="0"/>
-        <w:ind w:hanging="283" w:start="1418"/>
+        <w:ind w:hanging="283" w:left="1418"/>
         <w:jc w:val="both"/>
         <w:rPr>
           <w:rFonts w:ascii="Times New Roman" w:hAnsi="Times New Roman" w:cs="Times New Roman"/>
@@ -1360,7 +1347,7 @@
           <w:tab w:val="left" w:pos="0" w:leader="none"/>
         </w:tabs>
         <w:spacing w:lineRule="auto" w:line="360"/>
-        <w:ind w:hanging="283" w:start="1418"/>
+        <w:ind w:hanging="283" w:left="1418"/>
         <w:jc w:val="both"/>
         <w:rPr>
           <w:rFonts w:ascii="Times New Roman" w:hAnsi="Times New Roman" w:cs="Times New Roman"/>
@@ -1383,7 +1370,7 @@
       <w:pPr>
         <w:pStyle w:val="BodyText"/>
         <w:spacing w:lineRule="auto" w:line="360"/>
-        <w:jc w:val="start"/>
+        <w:jc w:val="left"/>
         <w:rPr>
           <w:rFonts w:ascii="Times New Roman" w:hAnsi="Times New Roman" w:cs="Times New Roman"/>
           <w:sz w:val="28"/>
@@ -1423,7 +1410,7 @@
       <w:pPr>
         <w:pStyle w:val="BodyText"/>
         <w:spacing w:lineRule="auto" w:line="360" w:before="0" w:after="0"/>
-        <w:jc w:val="start"/>
+        <w:jc w:val="left"/>
         <w:rPr>
           <w:rFonts w:ascii="Times New Roman" w:hAnsi="Times New Roman" w:cs="Times New Roman"/>
           <w:sz w:val="28"/>
@@ -1445,7 +1432,7 @@
       <w:pPr>
         <w:pStyle w:val="BodyText"/>
         <w:spacing w:lineRule="auto" w:line="360" w:before="0" w:after="0"/>
-        <w:jc w:val="start"/>
+        <w:jc w:val="left"/>
         <w:rPr>
           <w:rFonts w:ascii="Times New Roman" w:hAnsi="Times New Roman" w:cs="Times New Roman"/>
           <w:sz w:val="28"/>
@@ -1488,7 +1475,7 @@
       <w:pPr>
         <w:pStyle w:val="BodyText"/>
         <w:spacing w:lineRule="auto" w:line="360" w:before="0" w:after="0"/>
-        <w:jc w:val="start"/>
+        <w:jc w:val="left"/>
         <w:rPr/>
       </w:pPr>
       <w:r>
@@ -1506,8 +1493,7 @@
     <w:p>
       <w:pPr>
         <w:pStyle w:val="Normal"/>
-        <w:pBdr/>
-        <w:shd w:fill="1E1E1E" w:val="clear"/>
+        <w:shd w:val="clear" w:fill="1E1E1E"/>
         <w:rPr>
           <w:rFonts w:ascii="JetBrains Mono" w:hAnsi="JetBrains Mono"/>
           <w:b w:val="false"/>
@@ -24064,7 +24050,12 @@
         </w:rPr>
       </w:pPr>
       <w:r>
-        <w:rPr/>
+        <w:rPr>
+          <w:rFonts w:cs="Times New Roman" w:ascii="Times New Roman" w:hAnsi="Times New Roman"/>
+          <w:sz w:val="28"/>
+          <w:szCs w:val="28"/>
+          <w:lang w:val="en-US"/>
+        </w:rPr>
       </w:r>
     </w:p>
     <w:p>
@@ -24272,12 +24263,12 @@
       <w:start w:val="1"/>
       <w:numFmt w:val="bullet"/>
       <w:lvlText w:val=""/>
-      <w:lvlJc w:val="start"/>
+      <w:lvlJc w:val="left"/>
       <w:pPr>
         <w:tabs>
           <w:tab w:val="num" w:pos="709"/>
         </w:tabs>
-        <w:ind w:start="709" w:hanging="283"/>
+        <w:ind w:left="709" w:hanging="283"/>
       </w:pPr>
       <w:rPr>
         <w:rFonts w:ascii="Symbol" w:hAnsi="Symbol" w:cs="Symbol" w:hint="default"/>
@@ -24287,12 +24278,12 @@
       <w:start w:val="1"/>
       <w:numFmt w:val="bullet"/>
       <w:lvlText w:val=""/>
-      <w:lvlJc w:val="start"/>
+      <w:lvlJc w:val="left"/>
       <w:pPr>
         <w:tabs>
           <w:tab w:val="num" w:pos="1418"/>
         </w:tabs>
-        <w:ind w:start="1418" w:hanging="283"/>
+        <w:ind w:left="1418" w:hanging="283"/>
       </w:pPr>
       <w:rPr>
         <w:rFonts w:ascii="Symbol" w:hAnsi="Symbol" w:cs="Symbol" w:hint="default"/>
@@ -24302,12 +24293,12 @@
       <w:start w:val="1"/>
       <w:numFmt w:val="bullet"/>
       <w:lvlText w:val=""/>
-      <w:lvlJc w:val="start"/>
+      <w:lvlJc w:val="left"/>
       <w:pPr>
         <w:tabs>
           <w:tab w:val="num" w:pos="2127"/>
         </w:tabs>
-        <w:ind w:start="2127" w:hanging="283"/>
+        <w:ind w:left="2127" w:hanging="283"/>
       </w:pPr>
       <w:rPr>
         <w:rFonts w:ascii="Symbol" w:hAnsi="Symbol" w:cs="Symbol" w:hint="default"/>
@@ -24317,12 +24308,12 @@
       <w:start w:val="1"/>
       <w:numFmt w:val="bullet"/>
       <w:lvlText w:val=""/>
-      <w:lvlJc w:val="start"/>
+      <w:lvlJc w:val="left"/>
       <w:pPr>
         <w:tabs>
           <w:tab w:val="num" w:pos="2836"/>
         </w:tabs>
-        <w:ind w:start="2836" w:hanging="283"/>
+        <w:ind w:left="2836" w:hanging="283"/>
       </w:pPr>
       <w:rPr>
         <w:rFonts w:ascii="Symbol" w:hAnsi="Symbol" w:cs="Symbol" w:hint="default"/>
@@ -24332,12 +24323,12 @@
       <w:start w:val="1"/>
       <w:numFmt w:val="bullet"/>
       <w:lvlText w:val=""/>
-      <w:lvlJc w:val="start"/>
+      <w:lvlJc w:val="left"/>
       <w:pPr>
         <w:tabs>
           <w:tab w:val="num" w:pos="3545"/>
         </w:tabs>
-        <w:ind w:start="3545" w:hanging="283"/>
+        <w:ind w:left="3545" w:hanging="283"/>
       </w:pPr>
       <w:rPr>
         <w:rFonts w:ascii="Symbol" w:hAnsi="Symbol" w:cs="Symbol" w:hint="default"/>
@@ -24347,12 +24338,12 @@
       <w:start w:val="1"/>
       <w:numFmt w:val="bullet"/>
       <w:lvlText w:val=""/>
-      <w:lvlJc w:val="start"/>
+      <w:lvlJc w:val="left"/>
       <w:pPr>
         <w:tabs>
           <w:tab w:val="num" w:pos="4254"/>
         </w:tabs>
-        <w:ind w:start="4254" w:hanging="283"/>
+        <w:ind w:left="4254" w:hanging="283"/>
       </w:pPr>
       <w:rPr>
         <w:rFonts w:ascii="Symbol" w:hAnsi="Symbol" w:cs="Symbol" w:hint="default"/>
@@ -24362,12 +24353,12 @@
       <w:start w:val="1"/>
       <w:numFmt w:val="bullet"/>
       <w:lvlText w:val=""/>
-      <w:lvlJc w:val="start"/>
+      <w:lvlJc w:val="left"/>
       <w:pPr>
         <w:tabs>
           <w:tab w:val="num" w:pos="4963"/>
         </w:tabs>
-        <w:ind w:start="4963" w:hanging="283"/>
+        <w:ind w:left="4963" w:hanging="283"/>
       </w:pPr>
       <w:rPr>
         <w:rFonts w:ascii="Symbol" w:hAnsi="Symbol" w:cs="Symbol" w:hint="default"/>
@@ -24377,12 +24368,12 @@
       <w:start w:val="1"/>
       <w:numFmt w:val="bullet"/>
       <w:lvlText w:val=""/>
-      <w:lvlJc w:val="start"/>
+      <w:lvlJc w:val="left"/>
       <w:pPr>
         <w:tabs>
           <w:tab w:val="num" w:pos="5672"/>
         </w:tabs>
-        <w:ind w:start="5672" w:hanging="283"/>
+        <w:ind w:left="5672" w:hanging="283"/>
       </w:pPr>
       <w:rPr>
         <w:rFonts w:ascii="Symbol" w:hAnsi="Symbol" w:cs="Symbol" w:hint="default"/>
@@ -24392,12 +24383,12 @@
       <w:start w:val="1"/>
       <w:numFmt w:val="bullet"/>
       <w:lvlText w:val=""/>
-      <w:lvlJc w:val="start"/>
+      <w:lvlJc w:val="left"/>
       <w:pPr>
         <w:tabs>
           <w:tab w:val="num" w:pos="6381"/>
         </w:tabs>
-        <w:ind w:start="6381" w:hanging="283"/>
+        <w:ind w:left="6381" w:hanging="283"/>
       </w:pPr>
       <w:rPr>
         <w:rFonts w:ascii="Symbol" w:hAnsi="Symbol" w:cs="Symbol" w:hint="default"/>
@@ -24409,12 +24400,12 @@
       <w:start w:val="1"/>
       <w:numFmt w:val="bullet"/>
       <w:lvlText w:val=""/>
-      <w:lvlJc w:val="start"/>
+      <w:lvlJc w:val="left"/>
       <w:pPr>
         <w:tabs>
           <w:tab w:val="num" w:pos="709"/>
         </w:tabs>
-        <w:ind w:start="709" w:hanging="283"/>
+        <w:ind w:left="709" w:hanging="283"/>
       </w:pPr>
       <w:rPr>
         <w:rFonts w:ascii="Symbol" w:hAnsi="Symbol" w:cs="Symbol" w:hint="default"/>
@@ -24424,12 +24415,12 @@
       <w:start w:val="1"/>
       <w:numFmt w:val="bullet"/>
       <w:lvlText w:val=""/>
-      <w:lvlJc w:val="start"/>
+      <w:lvlJc w:val="left"/>
       <w:pPr>
         <w:tabs>
           <w:tab w:val="num" w:pos="1418"/>
         </w:tabs>
-        <w:ind w:start="1418" w:hanging="283"/>
+        <w:ind w:left="1418" w:hanging="283"/>
       </w:pPr>
       <w:rPr>
         <w:rFonts w:ascii="Symbol" w:hAnsi="Symbol" w:cs="Symbol" w:hint="default"/>
@@ -24439,12 +24430,12 @@
       <w:start w:val="1"/>
       <w:numFmt w:val="bullet"/>
       <w:lvlText w:val=""/>
-      <w:lvlJc w:val="start"/>
+      <w:lvlJc w:val="left"/>
       <w:pPr>
         <w:tabs>
           <w:tab w:val="num" w:pos="2127"/>
         </w:tabs>
-        <w:ind w:start="2127" w:hanging="283"/>
+        <w:ind w:left="2127" w:hanging="283"/>
       </w:pPr>
       <w:rPr>
         <w:rFonts w:ascii="Symbol" w:hAnsi="Symbol" w:cs="Symbol" w:hint="default"/>
@@ -24454,12 +24445,12 @@
       <w:start w:val="1"/>
       <w:numFmt w:val="bullet"/>
       <w:lvlText w:val=""/>
-      <w:lvlJc w:val="start"/>
+      <w:lvlJc w:val="left"/>
       <w:pPr>
         <w:tabs>
           <w:tab w:val="num" w:pos="2836"/>
         </w:tabs>
-        <w:ind w:start="2836" w:hanging="283"/>
+        <w:ind w:left="2836" w:hanging="283"/>
       </w:pPr>
       <w:rPr>
         <w:rFonts w:ascii="Symbol" w:hAnsi="Symbol" w:cs="Symbol" w:hint="default"/>
@@ -24469,12 +24460,12 @@
       <w:start w:val="1"/>
       <w:numFmt w:val="bullet"/>
       <w:lvlText w:val=""/>
-      <w:lvlJc w:val="start"/>
+      <w:lvlJc w:val="left"/>
       <w:pPr>
         <w:tabs>
           <w:tab w:val="num" w:pos="3545"/>
         </w:tabs>
-        <w:ind w:start="3545" w:hanging="283"/>
+        <w:ind w:left="3545" w:hanging="283"/>
       </w:pPr>
       <w:rPr>
         <w:rFonts w:ascii="Symbol" w:hAnsi="Symbol" w:cs="Symbol" w:hint="default"/>
@@ -24484,12 +24475,12 @@
       <w:start w:val="1"/>
       <w:numFmt w:val="bullet"/>
       <w:lvlText w:val=""/>
-      <w:lvlJc w:val="start"/>
+      <w:lvlJc w:val="left"/>
       <w:pPr>
         <w:tabs>
           <w:tab w:val="num" w:pos="4254"/>
         </w:tabs>
-        <w:ind w:start="4254" w:hanging="283"/>
+        <w:ind w:left="4254" w:hanging="283"/>
       </w:pPr>
       <w:rPr>
         <w:rFonts w:ascii="Symbol" w:hAnsi="Symbol" w:cs="Symbol" w:hint="default"/>
@@ -24499,12 +24490,12 @@
       <w:start w:val="1"/>
       <w:numFmt w:val="bullet"/>
       <w:lvlText w:val=""/>
-      <w:lvlJc w:val="start"/>
+      <w:lvlJc w:val="left"/>
       <w:pPr>
         <w:tabs>
           <w:tab w:val="num" w:pos="4963"/>
         </w:tabs>
-        <w:ind w:start="4963" w:hanging="283"/>
+        <w:ind w:left="4963" w:hanging="283"/>
       </w:pPr>
       <w:rPr>
         <w:rFonts w:ascii="Symbol" w:hAnsi="Symbol" w:cs="Symbol" w:hint="default"/>
@@ -24514,12 +24505,12 @@
       <w:start w:val="1"/>
       <w:numFmt w:val="bullet"/>
       <w:lvlText w:val=""/>
-      <w:lvlJc w:val="start"/>
+      <w:lvlJc w:val="left"/>
       <w:pPr>
         <w:tabs>
           <w:tab w:val="num" w:pos="5672"/>
         </w:tabs>
-        <w:ind w:start="5672" w:hanging="283"/>
+        <w:ind w:left="5672" w:hanging="283"/>
       </w:pPr>
       <w:rPr>
         <w:rFonts w:ascii="Symbol" w:hAnsi="Symbol" w:cs="Symbol" w:hint="default"/>
@@ -24529,12 +24520,12 @@
       <w:start w:val="1"/>
       <w:numFmt w:val="bullet"/>
       <w:lvlText w:val=""/>
-      <w:lvlJc w:val="start"/>
+      <w:lvlJc w:val="left"/>
       <w:pPr>
         <w:tabs>
           <w:tab w:val="num" w:pos="6381"/>
         </w:tabs>
-        <w:ind w:start="6381" w:hanging="283"/>
+        <w:ind w:left="6381" w:hanging="283"/>
       </w:pPr>
       <w:rPr>
         <w:rFonts w:ascii="Symbol" w:hAnsi="Symbol" w:cs="Symbol" w:hint="default"/>
@@ -24547,12 +24538,12 @@
       <w:numFmt w:val="none"/>
       <w:suff w:val="nothing"/>
       <w:lvlText w:val=""/>
-      <w:lvlJc w:val="start"/>
+      <w:lvlJc w:val="left"/>
       <w:pPr>
         <w:tabs>
           <w:tab w:val="num" w:pos="0"/>
         </w:tabs>
-        <w:ind w:start="0" w:hanging="0"/>
+        <w:ind w:left="0" w:hanging="0"/>
       </w:pPr>
     </w:lvl>
     <w:lvl w:ilvl="1">
@@ -24560,26 +24551,25 @@
       <w:numFmt w:val="none"/>
       <w:suff w:val="nothing"/>
       <w:lvlText w:val=""/>
-      <w:lvlJc w:val="start"/>
+      <w:lvlJc w:val="left"/>
       <w:pPr>
         <w:tabs>
           <w:tab w:val="num" w:pos="0"/>
         </w:tabs>
-        <w:ind w:start="0" w:hanging="0"/>
+        <w:ind w:left="0" w:hanging="0"/>
       </w:pPr>
     </w:lvl>
     <w:lvl w:ilvl="2">
       <w:start w:val="1"/>
       <w:numFmt w:val="none"/>
-      <w:pStyle w:val="Heading3"/>
       <w:suff w:val="nothing"/>
       <w:lvlText w:val=""/>
-      <w:lvlJc w:val="start"/>
+      <w:lvlJc w:val="left"/>
       <w:pPr>
         <w:tabs>
           <w:tab w:val="num" w:pos="0"/>
         </w:tabs>
-        <w:ind w:start="0" w:hanging="0"/>
+        <w:ind w:left="0" w:hanging="0"/>
       </w:pPr>
     </w:lvl>
     <w:lvl w:ilvl="3">
@@ -24587,12 +24577,12 @@
       <w:numFmt w:val="none"/>
       <w:suff w:val="nothing"/>
       <w:lvlText w:val=""/>
-      <w:lvlJc w:val="start"/>
+      <w:lvlJc w:val="left"/>
       <w:pPr>
         <w:tabs>
           <w:tab w:val="num" w:pos="0"/>
         </w:tabs>
-        <w:ind w:start="0" w:hanging="0"/>
+        <w:ind w:left="0" w:hanging="0"/>
       </w:pPr>
     </w:lvl>
     <w:lvl w:ilvl="4">
@@ -24600,12 +24590,12 @@
       <w:numFmt w:val="none"/>
       <w:suff w:val="nothing"/>
       <w:lvlText w:val=""/>
-      <w:lvlJc w:val="start"/>
+      <w:lvlJc w:val="left"/>
       <w:pPr>
         <w:tabs>
           <w:tab w:val="num" w:pos="0"/>
         </w:tabs>
-        <w:ind w:start="0" w:hanging="0"/>
+        <w:ind w:left="0" w:hanging="0"/>
       </w:pPr>
     </w:lvl>
     <w:lvl w:ilvl="5">
@@ -24613,12 +24603,12 @@
       <w:numFmt w:val="none"/>
       <w:suff w:val="nothing"/>
       <w:lvlText w:val=""/>
-      <w:lvlJc w:val="start"/>
+      <w:lvlJc w:val="left"/>
       <w:pPr>
         <w:tabs>
           <w:tab w:val="num" w:pos="0"/>
         </w:tabs>
-        <w:ind w:start="0" w:hanging="0"/>
+        <w:ind w:left="0" w:hanging="0"/>
       </w:pPr>
     </w:lvl>
     <w:lvl w:ilvl="6">
@@ -24626,12 +24616,12 @@
       <w:numFmt w:val="none"/>
       <w:suff w:val="nothing"/>
       <w:lvlText w:val=""/>
-      <w:lvlJc w:val="start"/>
+      <w:lvlJc w:val="left"/>
       <w:pPr>
         <w:tabs>
           <w:tab w:val="num" w:pos="0"/>
         </w:tabs>
-        <w:ind w:start="0" w:hanging="0"/>
+        <w:ind w:left="0" w:hanging="0"/>
       </w:pPr>
     </w:lvl>
     <w:lvl w:ilvl="7">
@@ -24639,12 +24629,12 @@
       <w:numFmt w:val="none"/>
       <w:suff w:val="nothing"/>
       <w:lvlText w:val=""/>
-      <w:lvlJc w:val="start"/>
+      <w:lvlJc w:val="left"/>
       <w:pPr>
         <w:tabs>
           <w:tab w:val="num" w:pos="0"/>
         </w:tabs>
-        <w:ind w:start="0" w:hanging="0"/>
+        <w:ind w:left="0" w:hanging="0"/>
       </w:pPr>
     </w:lvl>
     <w:lvl w:ilvl="8">
@@ -24652,12 +24642,12 @@
       <w:numFmt w:val="none"/>
       <w:suff w:val="nothing"/>
       <w:lvlText w:val=""/>
-      <w:lvlJc w:val="start"/>
+      <w:lvlJc w:val="left"/>
       <w:pPr>
         <w:tabs>
           <w:tab w:val="num" w:pos="0"/>
         </w:tabs>
-        <w:ind w:start="0" w:hanging="0"/>
+        <w:ind w:left="0" w:hanging="0"/>
       </w:pPr>
     </w:lvl>
   </w:abstractNum>
@@ -25074,9 +25064,10 @@
     <w:rsid w:val="00b10c62"/>
     <w:pPr>
       <w:widowControl/>
+      <w:suppressAutoHyphens w:val="true"/>
       <w:bidi w:val="0"/>
       <w:spacing w:lineRule="auto" w:line="276" w:before="0" w:after="0"/>
-      <w:jc w:val="start"/>
+      <w:jc w:val="left"/>
     </w:pPr>
     <w:rPr>
       <w:rFonts w:ascii="Arial" w:hAnsi="Arial" w:eastAsia="Arial" w:cs="Arial"/>
@@ -25084,7 +25075,7 @@
       <w:kern w:val="0"/>
       <w:sz w:val="22"/>
       <w:szCs w:val="22"/>
-      <w:lang w:eastAsia="uk-UA" w:val="uk-UA" w:bidi="ar-SA"/>
+      <w:lang w:val="uk-UA" w:eastAsia="uk-UA" w:bidi="ar-SA"/>
     </w:rPr>
   </w:style>
   <w:style w:type="paragraph" w:styleId="Heading3">
@@ -25171,8 +25162,8 @@
       <w:szCs w:val="20"/>
     </w:rPr>
   </w:style>
-  <w:style w:type="character" w:styleId="Bullets">
-    <w:name w:val="Bullets"/>
+  <w:style w:type="character" w:styleId="Bulletsuser">
+    <w:name w:val="Bullets (user)"/>
     <w:qFormat/>
     <w:rPr>
       <w:rFonts w:ascii="OpenSymbol" w:hAnsi="OpenSymbol" w:eastAsia="OpenSymbol" w:cs="OpenSymbol"/>

</xml_diff>